<commit_message>
Add member emails to report cover and title slide, rebuild report, slides and viva sheet, add annotated demo screenshot
</commit_message>
<xml_diff>
--- a/deliverables/IR_Group13_CaseHOLD_Report.docx
+++ b/deliverables/IR_Group13_CaseHOLD_Report.docx
@@ -154,6 +154,12 @@
               <w:spacing w:before="240" w:after="240"/>
               <w:jc w:val="center"/>
             </w:pPr>
+            <w:r>
+              <w:rPr>
+                <w:sz w:val="18"/>
+              </w:rPr>
+              <w:t>VAIBHAV.23FE10CSE00333@muj.manipal.edu</w:t>
+            </w:r>
           </w:p>
         </w:tc>
       </w:tr>
@@ -204,6 +210,12 @@
               <w:spacing w:before="240" w:after="240"/>
               <w:jc w:val="center"/>
             </w:pPr>
+            <w:r>
+              <w:rPr>
+                <w:sz w:val="18"/>
+              </w:rPr>
+              <w:t>Pranav.23FE10CSE00701@muj.manipal.edu</w:t>
+            </w:r>
           </w:p>
         </w:tc>
       </w:tr>
@@ -254,6 +266,11 @@
               <w:spacing w:before="240" w:after="240"/>
               <w:jc w:val="center"/>
             </w:pPr>
+            <w:r>
+              <w:rPr>
+                <w:sz w:val="24"/>
+              </w:rPr>
+            </w:r>
           </w:p>
         </w:tc>
       </w:tr>

</xml_diff>